<commit_message>
1. sınıf 19-23 Ekim değerlendirme paketi yeni tasarımla yenilendi
Co-Authored-By: Claude Opus 5.5 <noreply@anthropic.com>
Claude-Session: https://claude.ai/code/session_015eNxjDRpuUhEBqZHr5uXLv
</commit_message>
<xml_diff>
--- a/1-sinif-5-hafta-degerlendirme.docx
+++ b/1-sinif-5-hafta-degerlendirme.docx
@@ -4,12 +4,12 @@
   <w:body>
     <w:p>
       <w:pPr>
-        <w:spacing w:after="0" w:before="0"/>
+        <w:spacing w:line="240" w:lineRule="auto"/>
       </w:pPr>
       <w:r>
         <w:drawing>
           <wp:inline xmlns:a="http://schemas.openxmlformats.org/drawingml/2006/main" xmlns:pic="http://schemas.openxmlformats.org/drawingml/2006/picture">
-            <wp:extent cx="7560000" cy="10674000"/>
+            <wp:extent cx="7488000" cy="10584000"/>
             <wp:docPr id="1" name="Picture 1"/>
             <wp:cNvGraphicFramePr>
               <a:graphicFrameLocks noChangeAspect="1"/>
@@ -18,7 +18,7 @@
               <a:graphicData uri="http://schemas.openxmlformats.org/drawingml/2006/picture">
                 <pic:pic>
                   <pic:nvPicPr>
-                    <pic:cNvPr id="0" name="p-1.jpg"/>
+                    <pic:cNvPr id="0" name="p-01.jpg"/>
                     <pic:cNvPicPr/>
                   </pic:nvPicPr>
                   <pic:blipFill>
@@ -30,7 +30,7 @@
                   <pic:spPr>
                     <a:xfrm>
                       <a:off x="0" y="0"/>
-                      <a:ext cx="7560000" cy="10674000"/>
+                      <a:ext cx="7488000" cy="10584000"/>
                     </a:xfrm>
                     <a:prstGeom prst="rect"/>
                   </pic:spPr>
@@ -43,12 +43,13 @@
     </w:p>
     <w:p>
       <w:pPr>
-        <w:spacing w:after="0" w:before="0"/>
+        <w:pageBreakBefore/>
+        <w:spacing w:line="240" w:lineRule="auto"/>
       </w:pPr>
       <w:r>
         <w:drawing>
           <wp:inline xmlns:a="http://schemas.openxmlformats.org/drawingml/2006/main" xmlns:pic="http://schemas.openxmlformats.org/drawingml/2006/picture">
-            <wp:extent cx="7560000" cy="10674000"/>
+            <wp:extent cx="7488000" cy="10584000"/>
             <wp:docPr id="2" name="Picture 2"/>
             <wp:cNvGraphicFramePr>
               <a:graphicFrameLocks noChangeAspect="1"/>
@@ -57,7 +58,7 @@
               <a:graphicData uri="http://schemas.openxmlformats.org/drawingml/2006/picture">
                 <pic:pic>
                   <pic:nvPicPr>
-                    <pic:cNvPr id="0" name="p-2.jpg"/>
+                    <pic:cNvPr id="0" name="p-02.jpg"/>
                     <pic:cNvPicPr/>
                   </pic:nvPicPr>
                   <pic:blipFill>
@@ -69,7 +70,7 @@
                   <pic:spPr>
                     <a:xfrm>
                       <a:off x="0" y="0"/>
-                      <a:ext cx="7560000" cy="10674000"/>
+                      <a:ext cx="7488000" cy="10584000"/>
                     </a:xfrm>
                     <a:prstGeom prst="rect"/>
                   </pic:spPr>
@@ -82,12 +83,13 @@
     </w:p>
     <w:p>
       <w:pPr>
-        <w:spacing w:after="0" w:before="0"/>
+        <w:pageBreakBefore/>
+        <w:spacing w:line="240" w:lineRule="auto"/>
       </w:pPr>
       <w:r>
         <w:drawing>
           <wp:inline xmlns:a="http://schemas.openxmlformats.org/drawingml/2006/main" xmlns:pic="http://schemas.openxmlformats.org/drawingml/2006/picture">
-            <wp:extent cx="7560000" cy="10674000"/>
+            <wp:extent cx="7488000" cy="10584000"/>
             <wp:docPr id="3" name="Picture 3"/>
             <wp:cNvGraphicFramePr>
               <a:graphicFrameLocks noChangeAspect="1"/>
@@ -96,7 +98,7 @@
               <a:graphicData uri="http://schemas.openxmlformats.org/drawingml/2006/picture">
                 <pic:pic>
                   <pic:nvPicPr>
-                    <pic:cNvPr id="0" name="p-3.jpg"/>
+                    <pic:cNvPr id="0" name="p-03.jpg"/>
                     <pic:cNvPicPr/>
                   </pic:nvPicPr>
                   <pic:blipFill>
@@ -108,7 +110,7 @@
                   <pic:spPr>
                     <a:xfrm>
                       <a:off x="0" y="0"/>
-                      <a:ext cx="7560000" cy="10674000"/>
+                      <a:ext cx="7488000" cy="10584000"/>
                     </a:xfrm>
                     <a:prstGeom prst="rect"/>
                   </pic:spPr>
@@ -121,12 +123,13 @@
     </w:p>
     <w:p>
       <w:pPr>
-        <w:spacing w:after="0" w:before="0"/>
+        <w:pageBreakBefore/>
+        <w:spacing w:line="240" w:lineRule="auto"/>
       </w:pPr>
       <w:r>
         <w:drawing>
           <wp:inline xmlns:a="http://schemas.openxmlformats.org/drawingml/2006/main" xmlns:pic="http://schemas.openxmlformats.org/drawingml/2006/picture">
-            <wp:extent cx="7560000" cy="10674000"/>
+            <wp:extent cx="7488000" cy="10584000"/>
             <wp:docPr id="4" name="Picture 4"/>
             <wp:cNvGraphicFramePr>
               <a:graphicFrameLocks noChangeAspect="1"/>
@@ -135,7 +138,7 @@
               <a:graphicData uri="http://schemas.openxmlformats.org/drawingml/2006/picture">
                 <pic:pic>
                   <pic:nvPicPr>
-                    <pic:cNvPr id="0" name="p-4.jpg"/>
+                    <pic:cNvPr id="0" name="p-04.jpg"/>
                     <pic:cNvPicPr/>
                   </pic:nvPicPr>
                   <pic:blipFill>
@@ -147,7 +150,7 @@
                   <pic:spPr>
                     <a:xfrm>
                       <a:off x="0" y="0"/>
-                      <a:ext cx="7560000" cy="10674000"/>
+                      <a:ext cx="7488000" cy="10584000"/>
                     </a:xfrm>
                     <a:prstGeom prst="rect"/>
                   </pic:spPr>
@@ -160,12 +163,13 @@
     </w:p>
     <w:p>
       <w:pPr>
-        <w:spacing w:after="0" w:before="0"/>
+        <w:pageBreakBefore/>
+        <w:spacing w:line="240" w:lineRule="auto"/>
       </w:pPr>
       <w:r>
         <w:drawing>
           <wp:inline xmlns:a="http://schemas.openxmlformats.org/drawingml/2006/main" xmlns:pic="http://schemas.openxmlformats.org/drawingml/2006/picture">
-            <wp:extent cx="7560000" cy="10674000"/>
+            <wp:extent cx="7488000" cy="10584000"/>
             <wp:docPr id="5" name="Picture 5"/>
             <wp:cNvGraphicFramePr>
               <a:graphicFrameLocks noChangeAspect="1"/>
@@ -174,7 +178,7 @@
               <a:graphicData uri="http://schemas.openxmlformats.org/drawingml/2006/picture">
                 <pic:pic>
                   <pic:nvPicPr>
-                    <pic:cNvPr id="0" name="p-5.jpg"/>
+                    <pic:cNvPr id="0" name="p-05.jpg"/>
                     <pic:cNvPicPr/>
                   </pic:nvPicPr>
                   <pic:blipFill>
@@ -186,7 +190,7 @@
                   <pic:spPr>
                     <a:xfrm>
                       <a:off x="0" y="0"/>
-                      <a:ext cx="7560000" cy="10674000"/>
+                      <a:ext cx="7488000" cy="10584000"/>
                     </a:xfrm>
                     <a:prstGeom prst="rect"/>
                   </pic:spPr>
@@ -199,12 +203,13 @@
     </w:p>
     <w:p>
       <w:pPr>
-        <w:spacing w:after="0" w:before="0"/>
+        <w:pageBreakBefore/>
+        <w:spacing w:line="240" w:lineRule="auto"/>
       </w:pPr>
       <w:r>
         <w:drawing>
           <wp:inline xmlns:a="http://schemas.openxmlformats.org/drawingml/2006/main" xmlns:pic="http://schemas.openxmlformats.org/drawingml/2006/picture">
-            <wp:extent cx="7560000" cy="10674000"/>
+            <wp:extent cx="7488000" cy="10584000"/>
             <wp:docPr id="6" name="Picture 6"/>
             <wp:cNvGraphicFramePr>
               <a:graphicFrameLocks noChangeAspect="1"/>
@@ -213,7 +218,7 @@
               <a:graphicData uri="http://schemas.openxmlformats.org/drawingml/2006/picture">
                 <pic:pic>
                   <pic:nvPicPr>
-                    <pic:cNvPr id="0" name="p-6.jpg"/>
+                    <pic:cNvPr id="0" name="p-06.jpg"/>
                     <pic:cNvPicPr/>
                   </pic:nvPicPr>
                   <pic:blipFill>
@@ -225,7 +230,7 @@
                   <pic:spPr>
                     <a:xfrm>
                       <a:off x="0" y="0"/>
-                      <a:ext cx="7560000" cy="10674000"/>
+                      <a:ext cx="7488000" cy="10584000"/>
                     </a:xfrm>
                     <a:prstGeom prst="rect"/>
                   </pic:spPr>
@@ -238,12 +243,13 @@
     </w:p>
     <w:p>
       <w:pPr>
-        <w:spacing w:after="0" w:before="0"/>
+        <w:pageBreakBefore/>
+        <w:spacing w:line="240" w:lineRule="auto"/>
       </w:pPr>
       <w:r>
         <w:drawing>
           <wp:inline xmlns:a="http://schemas.openxmlformats.org/drawingml/2006/main" xmlns:pic="http://schemas.openxmlformats.org/drawingml/2006/picture">
-            <wp:extent cx="7560000" cy="10674000"/>
+            <wp:extent cx="7488000" cy="10584000"/>
             <wp:docPr id="7" name="Picture 7"/>
             <wp:cNvGraphicFramePr>
               <a:graphicFrameLocks noChangeAspect="1"/>
@@ -252,7 +258,7 @@
               <a:graphicData uri="http://schemas.openxmlformats.org/drawingml/2006/picture">
                 <pic:pic>
                   <pic:nvPicPr>
-                    <pic:cNvPr id="0" name="p-7.jpg"/>
+                    <pic:cNvPr id="0" name="p-07.jpg"/>
                     <pic:cNvPicPr/>
                   </pic:nvPicPr>
                   <pic:blipFill>
@@ -264,7 +270,7 @@
                   <pic:spPr>
                     <a:xfrm>
                       <a:off x="0" y="0"/>
-                      <a:ext cx="7560000" cy="10674000"/>
+                      <a:ext cx="7488000" cy="10584000"/>
                     </a:xfrm>
                     <a:prstGeom prst="rect"/>
                   </pic:spPr>
@@ -277,12 +283,13 @@
     </w:p>
     <w:p>
       <w:pPr>
-        <w:spacing w:after="0" w:before="0"/>
+        <w:pageBreakBefore/>
+        <w:spacing w:line="240" w:lineRule="auto"/>
       </w:pPr>
       <w:r>
         <w:drawing>
           <wp:inline xmlns:a="http://schemas.openxmlformats.org/drawingml/2006/main" xmlns:pic="http://schemas.openxmlformats.org/drawingml/2006/picture">
-            <wp:extent cx="7560000" cy="10674000"/>
+            <wp:extent cx="7488000" cy="10584000"/>
             <wp:docPr id="8" name="Picture 8"/>
             <wp:cNvGraphicFramePr>
               <a:graphicFrameLocks noChangeAspect="1"/>
@@ -291,7 +298,7 @@
               <a:graphicData uri="http://schemas.openxmlformats.org/drawingml/2006/picture">
                 <pic:pic>
                   <pic:nvPicPr>
-                    <pic:cNvPr id="0" name="p-8.jpg"/>
+                    <pic:cNvPr id="0" name="p-08.jpg"/>
                     <pic:cNvPicPr/>
                   </pic:nvPicPr>
                   <pic:blipFill>
@@ -303,7 +310,7 @@
                   <pic:spPr>
                     <a:xfrm>
                       <a:off x="0" y="0"/>
-                      <a:ext cx="7560000" cy="10674000"/>
+                      <a:ext cx="7488000" cy="10584000"/>
                     </a:xfrm>
                     <a:prstGeom prst="rect"/>
                   </pic:spPr>
@@ -316,12 +323,13 @@
     </w:p>
     <w:p>
       <w:pPr>
-        <w:spacing w:after="0" w:before="0"/>
+        <w:pageBreakBefore/>
+        <w:spacing w:line="240" w:lineRule="auto"/>
       </w:pPr>
       <w:r>
         <w:drawing>
           <wp:inline xmlns:a="http://schemas.openxmlformats.org/drawingml/2006/main" xmlns:pic="http://schemas.openxmlformats.org/drawingml/2006/picture">
-            <wp:extent cx="7560000" cy="10674000"/>
+            <wp:extent cx="7488000" cy="10584000"/>
             <wp:docPr id="9" name="Picture 9"/>
             <wp:cNvGraphicFramePr>
               <a:graphicFrameLocks noChangeAspect="1"/>
@@ -330,7 +338,7 @@
               <a:graphicData uri="http://schemas.openxmlformats.org/drawingml/2006/picture">
                 <pic:pic>
                   <pic:nvPicPr>
-                    <pic:cNvPr id="0" name="p-9.jpg"/>
+                    <pic:cNvPr id="0" name="p-09.jpg"/>
                     <pic:cNvPicPr/>
                   </pic:nvPicPr>
                   <pic:blipFill>
@@ -342,7 +350,127 @@
                   <pic:spPr>
                     <a:xfrm>
                       <a:off x="0" y="0"/>
-                      <a:ext cx="7560000" cy="10674000"/>
+                      <a:ext cx="7488000" cy="10584000"/>
+                    </a:xfrm>
+                    <a:prstGeom prst="rect"/>
+                  </pic:spPr>
+                </pic:pic>
+              </a:graphicData>
+            </a:graphic>
+          </wp:inline>
+        </w:drawing>
+      </w:r>
+    </w:p>
+    <w:p>
+      <w:pPr>
+        <w:pageBreakBefore/>
+        <w:spacing w:line="240" w:lineRule="auto"/>
+      </w:pPr>
+      <w:r>
+        <w:drawing>
+          <wp:inline xmlns:a="http://schemas.openxmlformats.org/drawingml/2006/main" xmlns:pic="http://schemas.openxmlformats.org/drawingml/2006/picture">
+            <wp:extent cx="7488000" cy="10584000"/>
+            <wp:docPr id="10" name="Picture 10"/>
+            <wp:cNvGraphicFramePr>
+              <a:graphicFrameLocks noChangeAspect="1"/>
+            </wp:cNvGraphicFramePr>
+            <a:graphic>
+              <a:graphicData uri="http://schemas.openxmlformats.org/drawingml/2006/picture">
+                <pic:pic>
+                  <pic:nvPicPr>
+                    <pic:cNvPr id="0" name="p-10.jpg"/>
+                    <pic:cNvPicPr/>
+                  </pic:nvPicPr>
+                  <pic:blipFill>
+                    <a:blip r:embed="rId18"/>
+                    <a:stretch>
+                      <a:fillRect/>
+                    </a:stretch>
+                  </pic:blipFill>
+                  <pic:spPr>
+                    <a:xfrm>
+                      <a:off x="0" y="0"/>
+                      <a:ext cx="7488000" cy="10584000"/>
+                    </a:xfrm>
+                    <a:prstGeom prst="rect"/>
+                  </pic:spPr>
+                </pic:pic>
+              </a:graphicData>
+            </a:graphic>
+          </wp:inline>
+        </w:drawing>
+      </w:r>
+    </w:p>
+    <w:p>
+      <w:pPr>
+        <w:pageBreakBefore/>
+        <w:spacing w:line="240" w:lineRule="auto"/>
+      </w:pPr>
+      <w:r>
+        <w:drawing>
+          <wp:inline xmlns:a="http://schemas.openxmlformats.org/drawingml/2006/main" xmlns:pic="http://schemas.openxmlformats.org/drawingml/2006/picture">
+            <wp:extent cx="7488000" cy="10584000"/>
+            <wp:docPr id="11" name="Picture 11"/>
+            <wp:cNvGraphicFramePr>
+              <a:graphicFrameLocks noChangeAspect="1"/>
+            </wp:cNvGraphicFramePr>
+            <a:graphic>
+              <a:graphicData uri="http://schemas.openxmlformats.org/drawingml/2006/picture">
+                <pic:pic>
+                  <pic:nvPicPr>
+                    <pic:cNvPr id="0" name="p-11.jpg"/>
+                    <pic:cNvPicPr/>
+                  </pic:nvPicPr>
+                  <pic:blipFill>
+                    <a:blip r:embed="rId19"/>
+                    <a:stretch>
+                      <a:fillRect/>
+                    </a:stretch>
+                  </pic:blipFill>
+                  <pic:spPr>
+                    <a:xfrm>
+                      <a:off x="0" y="0"/>
+                      <a:ext cx="7488000" cy="10584000"/>
+                    </a:xfrm>
+                    <a:prstGeom prst="rect"/>
+                  </pic:spPr>
+                </pic:pic>
+              </a:graphicData>
+            </a:graphic>
+          </wp:inline>
+        </w:drawing>
+      </w:r>
+    </w:p>
+    <w:p>
+      <w:pPr>
+        <w:pageBreakBefore/>
+        <w:spacing w:line="240" w:lineRule="auto"/>
+      </w:pPr>
+      <w:r>
+        <w:drawing>
+          <wp:inline xmlns:a="http://schemas.openxmlformats.org/drawingml/2006/main" xmlns:pic="http://schemas.openxmlformats.org/drawingml/2006/picture">
+            <wp:extent cx="7488000" cy="10584000"/>
+            <wp:docPr id="12" name="Picture 12"/>
+            <wp:cNvGraphicFramePr>
+              <a:graphicFrameLocks noChangeAspect="1"/>
+            </wp:cNvGraphicFramePr>
+            <a:graphic>
+              <a:graphicData uri="http://schemas.openxmlformats.org/drawingml/2006/picture">
+                <pic:pic>
+                  <pic:nvPicPr>
+                    <pic:cNvPr id="0" name="p-12.jpg"/>
+                    <pic:cNvPicPr/>
+                  </pic:nvPicPr>
+                  <pic:blipFill>
+                    <a:blip r:embed="rId20"/>
+                    <a:stretch>
+                      <a:fillRect/>
+                    </a:stretch>
+                  </pic:blipFill>
+                  <pic:spPr>
+                    <a:xfrm>
+                      <a:off x="0" y="0"/>
+                      <a:ext cx="7488000" cy="10584000"/>
                     </a:xfrm>
                     <a:prstGeom prst="rect"/>
                   </pic:spPr>
@@ -727,8 +855,11 @@
     <w:qFormat/>
     <w:rsid w:val="00FC693F"/>
     <w:pPr>
-      <w:spacing w:before="0" w:after="0"/>
-    </w:pPr>
+      <w:spacing w:after="0" w:before="0"/>
+    </w:pPr>
+    <w:rPr>
+      <w:sz w:val="2"/>
+    </w:rPr>
   </w:style>
   <w:style w:type="paragraph" w:styleId="Header">
     <w:name w:val="header"/>

</xml_diff>